<commit_message>
Proyecto Final: hybrid PID+CIL lane-following + longer demo videos; report updated
</commit_message>
<xml_diff>
--- a/Proyecto_Final/Proyecto_Final_Equipo18.docx
+++ b/Proyecto_Final/Proyecto_Final_Equipo18.docx
@@ -11400,6 +11400,34 @@
           <w:i w:val="0"/>
           <w:sz w:val="22"/>
         </w:rPr>
+        <w:t>Modo híbrido PID + CIL (seguimiento de carril):</w:t>
+      </w:r>
+    </w:p>
+    <w:p>
+      <w:pPr>
+        <w:spacing w:after="120"/>
+      </w:pPr>
+      <w:r>
+        <w:rPr>
+          <w:rFonts w:ascii="Arial" w:hAnsi="Arial"/>
+          <w:b w:val="0"/>
+          <w:i w:val="0"/>
+          <w:sz w:val="22"/>
+        </w:rPr>
+        <w:t>Para complementar la conservadora salida del modelo CIL en curvas, se implementó un modo híbrido donde el modelo CIL contribuye 30% del steering y un controlador PID basado en detección de la línea central amarilla aporta el 70% restante. Esta arquitectura preserva la generalización del modelo mientras garantiza seguimiento de carril robusto.</w:t>
+      </w:r>
+    </w:p>
+    <w:p>
+      <w:pPr>
+        <w:spacing w:after="120"/>
+      </w:pPr>
+      <w:r>
+        <w:rPr>
+          <w:rFonts w:ascii="Arial" w:hAnsi="Arial"/>
+          <w:b/>
+          <w:i w:val="0"/>
+          <w:sz w:val="22"/>
+        </w:rPr>
         <w:t>Hallazgos de las pruebas iterativas (corrección de bugs reales):</w:t>
       </w:r>
     </w:p>
@@ -13201,6 +13229,126 @@
                 <w:rFonts w:ascii="Courier New" w:hAnsi="Courier New" w:cs="Courier New"/>
                 <w:sz w:val="16"/>
               </w:rPr>
+              <w:t># --- Modo híbrido PID + CIL (seguimiento de carril robusto en World #2) ---</w:t>
+            </w:r>
+          </w:p>
+          <w:p>
+            <w:pPr>
+              <w:spacing w:after="0" w:before="0" w:line="240" w:lineRule="auto"/>
+            </w:pPr>
+            <w:r>
+              <w:rPr>
+                <w:rFonts w:ascii="Courier New" w:hAnsi="Courier New" w:cs="Courier New"/>
+                <w:sz w:val="16"/>
+              </w:rPr>
+              <w:t># El modelo CIL predice steering casi cero en World #2 (brecha de dominio</w:t>
+            </w:r>
+          </w:p>
+          <w:p>
+            <w:pPr>
+              <w:spacing w:after="0" w:before="0" w:line="240" w:lineRule="auto"/>
+            </w:pPr>
+            <w:r>
+              <w:rPr>
+                <w:rFonts w:ascii="Courier New" w:hAnsi="Courier New" w:cs="Courier New"/>
+                <w:sz w:val="16"/>
+              </w:rPr>
+              <w:t># World#1-&gt;World#2) y el coche se sale en curvas. En el estado CIL_CRUISE</w:t>
+            </w:r>
+          </w:p>
+          <w:p>
+            <w:pPr>
+              <w:spacing w:after="0" w:before="0" w:line="240" w:lineRule="auto"/>
+            </w:pPr>
+            <w:r>
+              <w:rPr>
+                <w:rFonts w:ascii="Courier New" w:hAnsi="Courier New" w:cs="Courier New"/>
+                <w:sz w:val="16"/>
+              </w:rPr>
+              <w:t># mezclamos la predicción del modelo con un PID basado en la línea central</w:t>
+            </w:r>
+          </w:p>
+          <w:p>
+            <w:pPr>
+              <w:spacing w:after="0" w:before="0" w:line="240" w:lineRule="auto"/>
+            </w:pPr>
+            <w:r>
+              <w:rPr>
+                <w:rFonts w:ascii="Courier New" w:hAnsi="Courier New" w:cs="Courier New"/>
+                <w:sz w:val="16"/>
+              </w:rPr>
+              <w:t># amarilla detectada en la cámara (patrón de la Actividad 2.1).</w:t>
+            </w:r>
+          </w:p>
+          <w:p>
+            <w:pPr>
+              <w:spacing w:after="0" w:before="0" w:line="240" w:lineRule="auto"/>
+            </w:pPr>
+            <w:r>
+              <w:rPr>
+                <w:rFonts w:ascii="Courier New" w:hAnsi="Courier New" w:cs="Courier New"/>
+                <w:sz w:val="16"/>
+              </w:rPr>
+              <w:t>HYBRID_MODE   = True</w:t>
+            </w:r>
+          </w:p>
+          <w:p>
+            <w:pPr>
+              <w:spacing w:after="0" w:before="0" w:line="240" w:lineRule="auto"/>
+            </w:pPr>
+            <w:r>
+              <w:rPr>
+                <w:rFonts w:ascii="Courier New" w:hAnsi="Courier New" w:cs="Courier New"/>
+                <w:sz w:val="16"/>
+              </w:rPr>
+              <w:t>LANE_PID_KP   = 0.4    # ganancia P sobre el error normalizado de la línea</w:t>
+            </w:r>
+          </w:p>
+          <w:p>
+            <w:pPr>
+              <w:spacing w:after="0" w:before="0" w:line="240" w:lineRule="auto"/>
+            </w:pPr>
+            <w:r>
+              <w:rPr>
+                <w:rFonts w:ascii="Courier New" w:hAnsi="Courier New" w:cs="Courier New"/>
+                <w:sz w:val="16"/>
+              </w:rPr>
+              <w:t>HYBRID_W_CIL  = 0.3    # peso de la predicción del modelo CIL</w:t>
+            </w:r>
+          </w:p>
+          <w:p>
+            <w:pPr>
+              <w:spacing w:after="0" w:before="0" w:line="240" w:lineRule="auto"/>
+            </w:pPr>
+            <w:r>
+              <w:rPr>
+                <w:rFonts w:ascii="Courier New" w:hAnsi="Courier New" w:cs="Courier New"/>
+                <w:sz w:val="16"/>
+              </w:rPr>
+              <w:t>HYBRID_W_PID  = 0.7    # peso del PID de la línea amarilla</w:t>
+            </w:r>
+          </w:p>
+          <w:p>
+            <w:pPr>
+              <w:spacing w:after="0" w:before="0" w:line="240" w:lineRule="auto"/>
+            </w:pPr>
+            <w:r>
+              <w:rPr>
+                <w:rFonts w:ascii="Courier New" w:hAnsi="Courier New" w:cs="Courier New"/>
+                <w:sz w:val="16"/>
+              </w:rPr>
+              <w:t xml:space="preserve"> </w:t>
+            </w:r>
+          </w:p>
+          <w:p>
+            <w:pPr>
+              <w:spacing w:after="0" w:before="0" w:line="240" w:lineRule="auto"/>
+            </w:pPr>
+            <w:r>
+              <w:rPr>
+                <w:rFonts w:ascii="Courier New" w:hAnsi="Courier New" w:cs="Courier New"/>
+                <w:sz w:val="16"/>
+              </w:rPr>
               <w:t># --- Entrada del modelo CIL (Codevilla) ---</w:t>
             </w:r>
           </w:p>
@@ -16081,6 +16229,234 @@
                 <w:rFonts w:ascii="Courier New" w:hAnsi="Courier New" w:cs="Courier New"/>
                 <w:sz w:val="16"/>
               </w:rPr>
+              <w:t>def compute_pid_steer(bgr, img_width):</w:t>
+            </w:r>
+          </w:p>
+          <w:p>
+            <w:pPr>
+              <w:spacing w:after="0" w:before="0" w:line="240" w:lineRule="auto"/>
+            </w:pPr>
+            <w:r>
+              <w:rPr>
+                <w:rFonts w:ascii="Courier New" w:hAnsi="Courier New" w:cs="Courier New"/>
+                <w:sz w:val="16"/>
+              </w:rPr>
+              <w:t xml:space="preserve">    """Steering PID basado en la línea central amarilla (patrón fotométrico de</w:t>
+            </w:r>
+          </w:p>
+          <w:p>
+            <w:pPr>
+              <w:spacing w:after="0" w:before="0" w:line="240" w:lineRule="auto"/>
+            </w:pPr>
+            <w:r>
+              <w:rPr>
+                <w:rFonts w:ascii="Courier New" w:hAnsi="Courier New" w:cs="Courier New"/>
+                <w:sz w:val="16"/>
+              </w:rPr>
+              <w:t xml:space="preserve">    la Actividad 2.1). Umbral HSV amarillo -&gt; centro de masa de los píxeles</w:t>
+            </w:r>
+          </w:p>
+          <w:p>
+            <w:pPr>
+              <w:spacing w:after="0" w:before="0" w:line="240" w:lineRule="auto"/>
+            </w:pPr>
+            <w:r>
+              <w:rPr>
+                <w:rFonts w:ascii="Courier New" w:hAnsi="Courier New" w:cs="Courier New"/>
+                <w:sz w:val="16"/>
+              </w:rPr>
+              <w:t xml:space="preserve">    amarillos en la mitad inferior de la imagen -&gt; error normalizado -&gt; -KP*error.</w:t>
+            </w:r>
+          </w:p>
+          <w:p>
+            <w:pPr>
+              <w:spacing w:after="0" w:before="0" w:line="240" w:lineRule="auto"/>
+            </w:pPr>
+            <w:r>
+              <w:rPr>
+                <w:rFonts w:ascii="Courier New" w:hAnsi="Courier New" w:cs="Courier New"/>
+                <w:sz w:val="16"/>
+              </w:rPr>
+              <w:t xml:space="preserve">    Devuelve (steer, lane_seen). lane_seen=False si no se ve la línea (el híbrido</w:t>
+            </w:r>
+          </w:p>
+          <w:p>
+            <w:pPr>
+              <w:spacing w:after="0" w:before="0" w:line="240" w:lineRule="auto"/>
+            </w:pPr>
+            <w:r>
+              <w:rPr>
+                <w:rFonts w:ascii="Courier New" w:hAnsi="Courier New" w:cs="Courier New"/>
+                <w:sz w:val="16"/>
+              </w:rPr>
+              <w:t xml:space="preserve">    cae de vuelta al modelo CIL en ese caso)."""</w:t>
+            </w:r>
+          </w:p>
+          <w:p>
+            <w:pPr>
+              <w:spacing w:after="0" w:before="0" w:line="240" w:lineRule="auto"/>
+            </w:pPr>
+            <w:r>
+              <w:rPr>
+                <w:rFonts w:ascii="Courier New" w:hAnsi="Courier New" w:cs="Courier New"/>
+                <w:sz w:val="16"/>
+              </w:rPr>
+              <w:t xml:space="preserve">    hsv = cv2.cvtColor(bgr, cv2.COLOR_BGR2HSV)</w:t>
+            </w:r>
+          </w:p>
+          <w:p>
+            <w:pPr>
+              <w:spacing w:after="0" w:before="0" w:line="240" w:lineRule="auto"/>
+            </w:pPr>
+            <w:r>
+              <w:rPr>
+                <w:rFonts w:ascii="Courier New" w:hAnsi="Courier New" w:cs="Courier New"/>
+                <w:sz w:val="16"/>
+              </w:rPr>
+              <w:t xml:space="preserve">    mask = cv2.inRange(hsv, np.array([15, 80, 80]), np.array([40, 255, 255]))</w:t>
+            </w:r>
+          </w:p>
+          <w:p>
+            <w:pPr>
+              <w:spacing w:after="0" w:before="0" w:line="240" w:lineRule="auto"/>
+            </w:pPr>
+            <w:r>
+              <w:rPr>
+                <w:rFonts w:ascii="Courier New" w:hAnsi="Courier New" w:cs="Courier New"/>
+                <w:sz w:val="16"/>
+              </w:rPr>
+              <w:t xml:space="preserve">    h = mask.shape[0]</w:t>
+            </w:r>
+          </w:p>
+          <w:p>
+            <w:pPr>
+              <w:spacing w:after="0" w:before="0" w:line="240" w:lineRule="auto"/>
+            </w:pPr>
+            <w:r>
+              <w:rPr>
+                <w:rFonts w:ascii="Courier New" w:hAnsi="Courier New" w:cs="Courier New"/>
+                <w:sz w:val="16"/>
+              </w:rPr>
+              <w:t xml:space="preserve">    lower = mask[h // 2:, :]                      # sólo la mitad inferior</w:t>
+            </w:r>
+          </w:p>
+          <w:p>
+            <w:pPr>
+              <w:spacing w:after="0" w:before="0" w:line="240" w:lineRule="auto"/>
+            </w:pPr>
+            <w:r>
+              <w:rPr>
+                <w:rFonts w:ascii="Courier New" w:hAnsi="Courier New" w:cs="Courier New"/>
+                <w:sz w:val="16"/>
+              </w:rPr>
+              <w:t xml:space="preserve">    m = cv2.moments(lower)</w:t>
+            </w:r>
+          </w:p>
+          <w:p>
+            <w:pPr>
+              <w:spacing w:after="0" w:before="0" w:line="240" w:lineRule="auto"/>
+            </w:pPr>
+            <w:r>
+              <w:rPr>
+                <w:rFonts w:ascii="Courier New" w:hAnsi="Courier New" w:cs="Courier New"/>
+                <w:sz w:val="16"/>
+              </w:rPr>
+              <w:t xml:space="preserve">    if m["m00"] &lt; 1e-3:</w:t>
+            </w:r>
+          </w:p>
+          <w:p>
+            <w:pPr>
+              <w:spacing w:after="0" w:before="0" w:line="240" w:lineRule="auto"/>
+            </w:pPr>
+            <w:r>
+              <w:rPr>
+                <w:rFonts w:ascii="Courier New" w:hAnsi="Courier New" w:cs="Courier New"/>
+                <w:sz w:val="16"/>
+              </w:rPr>
+              <w:t xml:space="preserve">        return 0.0, False                          # no hay línea amarilla visible</w:t>
+            </w:r>
+          </w:p>
+          <w:p>
+            <w:pPr>
+              <w:spacing w:after="0" w:before="0" w:line="240" w:lineRule="auto"/>
+            </w:pPr>
+            <w:r>
+              <w:rPr>
+                <w:rFonts w:ascii="Courier New" w:hAnsi="Courier New" w:cs="Courier New"/>
+                <w:sz w:val="16"/>
+              </w:rPr>
+              <w:t xml:space="preserve">    cm_x = m["m10"] / m["m00"]</w:t>
+            </w:r>
+          </w:p>
+          <w:p>
+            <w:pPr>
+              <w:spacing w:after="0" w:before="0" w:line="240" w:lineRule="auto"/>
+            </w:pPr>
+            <w:r>
+              <w:rPr>
+                <w:rFonts w:ascii="Courier New" w:hAnsi="Courier New" w:cs="Courier New"/>
+                <w:sz w:val="16"/>
+              </w:rPr>
+              <w:t xml:space="preserve">    error = (img_width / 2.0 - cm_x) / (img_width / 2.0)</w:t>
+            </w:r>
+          </w:p>
+          <w:p>
+            <w:pPr>
+              <w:spacing w:after="0" w:before="0" w:line="240" w:lineRule="auto"/>
+            </w:pPr>
+            <w:r>
+              <w:rPr>
+                <w:rFonts w:ascii="Courier New" w:hAnsi="Courier New" w:cs="Courier New"/>
+                <w:sz w:val="16"/>
+              </w:rPr>
+              <w:t xml:space="preserve">    steer = -LANE_PID_KP * error</w:t>
+            </w:r>
+          </w:p>
+          <w:p>
+            <w:pPr>
+              <w:spacing w:after="0" w:before="0" w:line="240" w:lineRule="auto"/>
+            </w:pPr>
+            <w:r>
+              <w:rPr>
+                <w:rFonts w:ascii="Courier New" w:hAnsi="Courier New" w:cs="Courier New"/>
+                <w:sz w:val="16"/>
+              </w:rPr>
+              <w:t xml:space="preserve">    return max(-MAX_STEERING_ANGLE, min(MAX_STEERING_ANGLE, steer)), True</w:t>
+            </w:r>
+          </w:p>
+          <w:p>
+            <w:pPr>
+              <w:spacing w:after="0" w:before="0" w:line="240" w:lineRule="auto"/>
+            </w:pPr>
+            <w:r>
+              <w:rPr>
+                <w:rFonts w:ascii="Courier New" w:hAnsi="Courier New" w:cs="Courier New"/>
+                <w:sz w:val="16"/>
+              </w:rPr>
+              <w:t xml:space="preserve"> </w:t>
+            </w:r>
+          </w:p>
+          <w:p>
+            <w:pPr>
+              <w:spacing w:after="0" w:before="0" w:line="240" w:lineRule="auto"/>
+            </w:pPr>
+            <w:r>
+              <w:rPr>
+                <w:rFonts w:ascii="Courier New" w:hAnsi="Courier New" w:cs="Courier New"/>
+                <w:sz w:val="16"/>
+              </w:rPr>
+              <w:t xml:space="preserve"> </w:t>
+            </w:r>
+          </w:p>
+          <w:p>
+            <w:pPr>
+              <w:spacing w:after="0" w:before="0" w:line="240" w:lineRule="auto"/>
+            </w:pPr>
+            <w:r>
+              <w:rPr>
+                <w:rFonts w:ascii="Courier New" w:hAnsi="Courier New" w:cs="Courier New"/>
+                <w:sz w:val="16"/>
+              </w:rPr>
               <w:t># =============================================================================</w:t>
             </w:r>
           </w:p>
@@ -17893,7 +18269,7 @@
                 <w:rFonts w:ascii="Courier New" w:hAnsi="Courier New" w:cs="Courier New"/>
                 <w:sz w:val="16"/>
               </w:rPr>
-              <w:t xml:space="preserve">             steer_applied, radar_m, lidar_m):</w:t>
+              <w:t xml:space="preserve">             steer_applied, radar_m, lidar_m, pid_steer=0.0):</w:t>
             </w:r>
           </w:p>
           <w:p>
@@ -18001,7 +18377,7 @@
                 <w:rFonts w:ascii="Courier New" w:hAnsi="Courier New" w:cs="Courier New"/>
                 <w:sz w:val="16"/>
               </w:rPr>
-              <w:t xml:space="preserve">    # Centro: predicción cruda del modelo.</w:t>
+              <w:t xml:space="preserve">    # Centro: predicción cruda del modelo + mezcla híbrida.</w:t>
             </w:r>
           </w:p>
           <w:p>
@@ -18037,6 +18413,30 @@
                 <w:rFonts w:ascii="Courier New" w:hAnsi="Courier New" w:cs="Courier New"/>
                 <w:sz w:val="16"/>
               </w:rPr>
+              <w:t xml:space="preserve">    if HYBRID_MODE:</w:t>
+            </w:r>
+          </w:p>
+          <w:p>
+            <w:pPr>
+              <w:spacing w:after="0" w:before="0" w:line="240" w:lineRule="auto"/>
+            </w:pPr>
+            <w:r>
+              <w:rPr>
+                <w:rFonts w:ascii="Courier New" w:hAnsi="Courier New" w:cs="Courier New"/>
+                <w:sz w:val="16"/>
+              </w:rPr>
+              <w:t xml:space="preserve">        display.drawText(f"PID:{pid_steer:+.3f}  CIL:{model_steer:+.3f}", 4, dh // 2 + 6)</w:t>
+            </w:r>
+          </w:p>
+          <w:p>
+            <w:pPr>
+              <w:spacing w:after="0" w:before="0" w:line="240" w:lineRule="auto"/>
+            </w:pPr>
+            <w:r>
+              <w:rPr>
+                <w:rFonts w:ascii="Courier New" w:hAnsi="Courier New" w:cs="Courier New"/>
+                <w:sz w:val="16"/>
+              </w:rPr>
               <w:t xml:space="preserve">    # Abajo-izquierda: velocidad + steering aplicado.</w:t>
             </w:r>
           </w:p>
@@ -20629,6 +21029,78 @@
                 <w:rFonts w:ascii="Courier New" w:hAnsi="Courier New" w:cs="Courier New"/>
                 <w:sz w:val="16"/>
               </w:rPr>
+              <w:t xml:space="preserve">        # 4b. PID de línea amarilla (modo híbrido). Se calcula cada tick para el HUD.</w:t>
+            </w:r>
+          </w:p>
+          <w:p>
+            <w:pPr>
+              <w:spacing w:after="0" w:before="0" w:line="240" w:lineRule="auto"/>
+            </w:pPr>
+            <w:r>
+              <w:rPr>
+                <w:rFonts w:ascii="Courier New" w:hAnsi="Courier New" w:cs="Courier New"/>
+                <w:sz w:val="16"/>
+              </w:rPr>
+              <w:t xml:space="preserve">        if HYBRID_MODE:</w:t>
+            </w:r>
+          </w:p>
+          <w:p>
+            <w:pPr>
+              <w:spacing w:after="0" w:before="0" w:line="240" w:lineRule="auto"/>
+            </w:pPr>
+            <w:r>
+              <w:rPr>
+                <w:rFonts w:ascii="Courier New" w:hAnsi="Courier New" w:cs="Courier New"/>
+                <w:sz w:val="16"/>
+              </w:rPr>
+              <w:t xml:space="preserve">            pid_steer, lane_seen = compute_pid_steer(bgr, img_width)</w:t>
+            </w:r>
+          </w:p>
+          <w:p>
+            <w:pPr>
+              <w:spacing w:after="0" w:before="0" w:line="240" w:lineRule="auto"/>
+            </w:pPr>
+            <w:r>
+              <w:rPr>
+                <w:rFonts w:ascii="Courier New" w:hAnsi="Courier New" w:cs="Courier New"/>
+                <w:sz w:val="16"/>
+              </w:rPr>
+              <w:t xml:space="preserve">        else:</w:t>
+            </w:r>
+          </w:p>
+          <w:p>
+            <w:pPr>
+              <w:spacing w:after="0" w:before="0" w:line="240" w:lineRule="auto"/>
+            </w:pPr>
+            <w:r>
+              <w:rPr>
+                <w:rFonts w:ascii="Courier New" w:hAnsi="Courier New" w:cs="Courier New"/>
+                <w:sz w:val="16"/>
+              </w:rPr>
+              <w:t xml:space="preserve">            pid_steer, lane_seen = 0.0, False</w:t>
+            </w:r>
+          </w:p>
+          <w:p>
+            <w:pPr>
+              <w:spacing w:after="0" w:before="0" w:line="240" w:lineRule="auto"/>
+            </w:pPr>
+            <w:r>
+              <w:rPr>
+                <w:rFonts w:ascii="Courier New" w:hAnsi="Courier New" w:cs="Courier New"/>
+                <w:sz w:val="16"/>
+              </w:rPr>
+              <w:t xml:space="preserve"> </w:t>
+            </w:r>
+          </w:p>
+          <w:p>
+            <w:pPr>
+              <w:spacing w:after="0" w:before="0" w:line="240" w:lineRule="auto"/>
+            </w:pPr>
+            <w:r>
+              <w:rPr>
+                <w:rFonts w:ascii="Courier New" w:hAnsi="Courier New" w:cs="Courier New"/>
+                <w:sz w:val="16"/>
+              </w:rPr>
               <w:t xml:space="preserve">        # 5. Decisión de estado (prioridad documentada).</w:t>
             </w:r>
           </w:p>
@@ -20917,6 +21389,270 @@
                 <w:rFonts w:ascii="Courier New" w:hAnsi="Courier New" w:cs="Courier New"/>
                 <w:sz w:val="16"/>
               </w:rPr>
+              <w:t xml:space="preserve">            # Híbrido: 30% CIL + 70% PID de línea amarilla (si se ve la línea).</w:t>
+            </w:r>
+          </w:p>
+          <w:p>
+            <w:pPr>
+              <w:spacing w:after="0" w:before="0" w:line="240" w:lineRule="auto"/>
+            </w:pPr>
+            <w:r>
+              <w:rPr>
+                <w:rFonts w:ascii="Courier New" w:hAnsi="Courier New" w:cs="Courier New"/>
+                <w:sz w:val="16"/>
+              </w:rPr>
+              <w:t xml:space="preserve">            # Sin línea visible, se usa sólo la predicción del modelo.</w:t>
+            </w:r>
+          </w:p>
+          <w:p>
+            <w:pPr>
+              <w:spacing w:after="0" w:before="0" w:line="240" w:lineRule="auto"/>
+            </w:pPr>
+            <w:r>
+              <w:rPr>
+                <w:rFonts w:ascii="Courier New" w:hAnsi="Courier New" w:cs="Courier New"/>
+                <w:sz w:val="16"/>
+              </w:rPr>
+              <w:t xml:space="preserve">            if HYBRID_MODE and lane_seen:</w:t>
+            </w:r>
+          </w:p>
+          <w:p>
+            <w:pPr>
+              <w:spacing w:after="0" w:before="0" w:line="240" w:lineRule="auto"/>
+            </w:pPr>
+            <w:r>
+              <w:rPr>
+                <w:rFonts w:ascii="Courier New" w:hAnsi="Courier New" w:cs="Courier New"/>
+                <w:sz w:val="16"/>
+              </w:rPr>
+              <w:t xml:space="preserve">                steering = max(-MAX_STEERING_ANGLE, min(MAX_STEERING_ANGLE,</w:t>
+            </w:r>
+          </w:p>
+          <w:p>
+            <w:pPr>
+              <w:spacing w:after="0" w:before="0" w:line="240" w:lineRule="auto"/>
+            </w:pPr>
+            <w:r>
+              <w:rPr>
+                <w:rFonts w:ascii="Courier New" w:hAnsi="Courier New" w:cs="Courier New"/>
+                <w:sz w:val="16"/>
+              </w:rPr>
+              <w:t xml:space="preserve">                               HYBRID_W_CIL * model_steer + HYBRID_W_PID * pid_steer))</w:t>
+            </w:r>
+          </w:p>
+          <w:p>
+            <w:pPr>
+              <w:spacing w:after="0" w:before="0" w:line="240" w:lineRule="auto"/>
+            </w:pPr>
+            <w:r>
+              <w:rPr>
+                <w:rFonts w:ascii="Courier New" w:hAnsi="Courier New" w:cs="Courier New"/>
+                <w:sz w:val="16"/>
+              </w:rPr>
+              <w:t xml:space="preserve">            else:</w:t>
+            </w:r>
+          </w:p>
+          <w:p>
+            <w:pPr>
+              <w:spacing w:after="0" w:before="0" w:line="240" w:lineRule="auto"/>
+            </w:pPr>
+            <w:r>
+              <w:rPr>
+                <w:rFonts w:ascii="Courier New" w:hAnsi="Courier New" w:cs="Courier New"/>
+                <w:sz w:val="16"/>
+              </w:rPr>
+              <w:t xml:space="preserve">                steering = max(-MAX_STEERING_ANGLE, min(MAX_STEERING_ANGLE, model_steer))</w:t>
+            </w:r>
+          </w:p>
+          <w:p>
+            <w:pPr>
+              <w:spacing w:after="0" w:before="0" w:line="240" w:lineRule="auto"/>
+            </w:pPr>
+            <w:r>
+              <w:rPr>
+                <w:rFonts w:ascii="Courier New" w:hAnsi="Courier New" w:cs="Courier New"/>
+                <w:sz w:val="16"/>
+              </w:rPr>
+              <w:t xml:space="preserve">            target_speed = TARGET_SPEED_KMH</w:t>
+            </w:r>
+          </w:p>
+          <w:p>
+            <w:pPr>
+              <w:spacing w:after="0" w:before="0" w:line="240" w:lineRule="auto"/>
+            </w:pPr>
+            <w:r>
+              <w:rPr>
+                <w:rFonts w:ascii="Courier New" w:hAnsi="Courier New" w:cs="Courier New"/>
+                <w:sz w:val="16"/>
+              </w:rPr>
+              <w:t xml:space="preserve"> </w:t>
+            </w:r>
+          </w:p>
+          <w:p>
+            <w:pPr>
+              <w:spacing w:after="0" w:before="0" w:line="240" w:lineRule="auto"/>
+            </w:pPr>
+            <w:r>
+              <w:rPr>
+                <w:rFonts w:ascii="Courier New" w:hAnsi="Courier New" w:cs="Courier New"/>
+                <w:sz w:val="16"/>
+              </w:rPr>
+              <w:t xml:space="preserve">        elif state == STATE_EMERGENCY_BRAKE:</w:t>
+            </w:r>
+          </w:p>
+          <w:p>
+            <w:pPr>
+              <w:spacing w:after="0" w:before="0" w:line="240" w:lineRule="auto"/>
+            </w:pPr>
+            <w:r>
+              <w:rPr>
+                <w:rFonts w:ascii="Courier New" w:hAnsi="Courier New" w:cs="Courier New"/>
+                <w:sz w:val="16"/>
+              </w:rPr>
+              <w:t xml:space="preserve">            # Mantener la última dirección razonable (recta) y frenar.</w:t>
+            </w:r>
+          </w:p>
+          <w:p>
+            <w:pPr>
+              <w:spacing w:after="0" w:before="0" w:line="240" w:lineRule="auto"/>
+            </w:pPr>
+            <w:r>
+              <w:rPr>
+                <w:rFonts w:ascii="Courier New" w:hAnsi="Courier New" w:cs="Courier New"/>
+                <w:sz w:val="16"/>
+              </w:rPr>
+              <w:t xml:space="preserve">            steering = 0.0</w:t>
+            </w:r>
+          </w:p>
+          <w:p>
+            <w:pPr>
+              <w:spacing w:after="0" w:before="0" w:line="240" w:lineRule="auto"/>
+            </w:pPr>
+            <w:r>
+              <w:rPr>
+                <w:rFonts w:ascii="Courier New" w:hAnsi="Courier New" w:cs="Courier New"/>
+                <w:sz w:val="16"/>
+              </w:rPr>
+              <w:t xml:space="preserve">            target_speed = 0.0</w:t>
+            </w:r>
+          </w:p>
+          <w:p>
+            <w:pPr>
+              <w:spacing w:after="0" w:before="0" w:line="240" w:lineRule="auto"/>
+            </w:pPr>
+            <w:r>
+              <w:rPr>
+                <w:rFonts w:ascii="Courier New" w:hAnsi="Courier New" w:cs="Courier New"/>
+                <w:sz w:val="16"/>
+              </w:rPr>
+              <w:t xml:space="preserve">            ev = None  # cualquier evasión queda cancelada mientras frenamos</w:t>
+            </w:r>
+          </w:p>
+          <w:p>
+            <w:pPr>
+              <w:spacing w:after="0" w:before="0" w:line="240" w:lineRule="auto"/>
+            </w:pPr>
+            <w:r>
+              <w:rPr>
+                <w:rFonts w:ascii="Courier New" w:hAnsi="Courier New" w:cs="Courier New"/>
+                <w:sz w:val="16"/>
+              </w:rPr>
+              <w:t xml:space="preserve"> </w:t>
+            </w:r>
+          </w:p>
+          <w:p>
+            <w:pPr>
+              <w:spacing w:after="0" w:before="0" w:line="240" w:lineRule="auto"/>
+            </w:pPr>
+            <w:r>
+              <w:rPr>
+                <w:rFonts w:ascii="Courier New" w:hAnsi="Courier New" w:cs="Courier New"/>
+                <w:sz w:val="16"/>
+              </w:rPr>
+              <w:t xml:space="preserve">        elif state == STATE_EVASION:</w:t>
+            </w:r>
+          </w:p>
+          <w:p>
+            <w:pPr>
+              <w:spacing w:after="0" w:before="0" w:line="240" w:lineRule="auto"/>
+            </w:pPr>
+            <w:r>
+              <w:rPr>
+                <w:rFonts w:ascii="Courier New" w:hAnsi="Courier New" w:cs="Courier New"/>
+                <w:sz w:val="16"/>
+              </w:rPr>
+              <w:t xml:space="preserve">            steering, target_speed, done = step_evasion(ev, yaw_z, lidar_front_m)</w:t>
+            </w:r>
+          </w:p>
+          <w:p>
+            <w:pPr>
+              <w:spacing w:after="0" w:before="0" w:line="240" w:lineRule="auto"/>
+            </w:pPr>
+            <w:r>
+              <w:rPr>
+                <w:rFonts w:ascii="Courier New" w:hAnsi="Courier New" w:cs="Courier New"/>
+                <w:sz w:val="16"/>
+              </w:rPr>
+              <w:t xml:space="preserve">            if done:</w:t>
+            </w:r>
+          </w:p>
+          <w:p>
+            <w:pPr>
+              <w:spacing w:after="0" w:before="0" w:line="240" w:lineRule="auto"/>
+            </w:pPr>
+            <w:r>
+              <w:rPr>
+                <w:rFonts w:ascii="Courier New" w:hAnsi="Courier New" w:cs="Courier New"/>
+                <w:sz w:val="16"/>
+              </w:rPr>
+              <w:t xml:space="preserve">                ev = None</w:t>
+            </w:r>
+          </w:p>
+          <w:p>
+            <w:pPr>
+              <w:spacing w:after="0" w:before="0" w:line="240" w:lineRule="auto"/>
+            </w:pPr>
+            <w:r>
+              <w:rPr>
+                <w:rFonts w:ascii="Courier New" w:hAnsi="Courier New" w:cs="Courier New"/>
+                <w:sz w:val="16"/>
+              </w:rPr>
+              <w:t xml:space="preserve">                state = STATE_CIL_CRUISE</w:t>
+            </w:r>
+          </w:p>
+          <w:p>
+            <w:pPr>
+              <w:spacing w:after="0" w:before="0" w:line="240" w:lineRule="auto"/>
+            </w:pPr>
+            <w:r>
+              <w:rPr>
+                <w:rFonts w:ascii="Courier New" w:hAnsi="Courier New" w:cs="Courier New"/>
+                <w:sz w:val="16"/>
+              </w:rPr>
+              <w:t xml:space="preserve"> </w:t>
+            </w:r>
+          </w:p>
+          <w:p>
+            <w:pPr>
+              <w:spacing w:after="0" w:before="0" w:line="240" w:lineRule="auto"/>
+            </w:pPr>
+            <w:r>
+              <w:rPr>
+                <w:rFonts w:ascii="Courier New" w:hAnsi="Courier New" w:cs="Courier New"/>
+                <w:sz w:val="16"/>
+              </w:rPr>
+              <w:t xml:space="preserve">        elif state == STATE_CAR_FOLLOW_STOP:</w:t>
+            </w:r>
+          </w:p>
+          <w:p>
+            <w:pPr>
+              <w:spacing w:after="0" w:before="0" w:line="240" w:lineRule="auto"/>
+            </w:pPr>
+            <w:r>
+              <w:rPr>
+                <w:rFonts w:ascii="Courier New" w:hAnsi="Courier New" w:cs="Courier New"/>
+                <w:sz w:val="16"/>
+              </w:rPr>
               <w:t xml:space="preserve">            steering = max(-MAX_STEERING_ANGLE, min(MAX_STEERING_ANGLE, model_steer))</w:t>
             </w:r>
           </w:p>
@@ -20929,6 +21665,114 @@
                 <w:rFonts w:ascii="Courier New" w:hAnsi="Courier New" w:cs="Courier New"/>
                 <w:sz w:val="16"/>
               </w:rPr>
+              <w:t xml:space="preserve">            target_speed = 0.0</w:t>
+            </w:r>
+          </w:p>
+          <w:p>
+            <w:pPr>
+              <w:spacing w:after="0" w:before="0" w:line="240" w:lineRule="auto"/>
+            </w:pPr>
+            <w:r>
+              <w:rPr>
+                <w:rFonts w:ascii="Courier New" w:hAnsi="Courier New" w:cs="Courier New"/>
+                <w:sz w:val="16"/>
+              </w:rPr>
+              <w:t xml:space="preserve"> </w:t>
+            </w:r>
+          </w:p>
+          <w:p>
+            <w:pPr>
+              <w:spacing w:after="0" w:before="0" w:line="240" w:lineRule="auto"/>
+            </w:pPr>
+            <w:r>
+              <w:rPr>
+                <w:rFonts w:ascii="Courier New" w:hAnsi="Courier New" w:cs="Courier New"/>
+                <w:sz w:val="16"/>
+              </w:rPr>
+              <w:t xml:space="preserve">        elif state == STATE_CAR_FOLLOW_SLOW:</w:t>
+            </w:r>
+          </w:p>
+          <w:p>
+            <w:pPr>
+              <w:spacing w:after="0" w:before="0" w:line="240" w:lineRule="auto"/>
+            </w:pPr>
+            <w:r>
+              <w:rPr>
+                <w:rFonts w:ascii="Courier New" w:hAnsi="Courier New" w:cs="Courier New"/>
+                <w:sz w:val="16"/>
+              </w:rPr>
+              <w:t xml:space="preserve">            # Mantenemos la dirección del modelo, sólo escalamos la velocidad.</w:t>
+            </w:r>
+          </w:p>
+          <w:p>
+            <w:pPr>
+              <w:spacing w:after="0" w:before="0" w:line="240" w:lineRule="auto"/>
+            </w:pPr>
+            <w:r>
+              <w:rPr>
+                <w:rFonts w:ascii="Courier New" w:hAnsi="Courier New" w:cs="Courier New"/>
+                <w:sz w:val="16"/>
+              </w:rPr>
+              <w:t xml:space="preserve">            steering = max(-MAX_STEERING_ANGLE, min(MAX_STEERING_ANGLE, model_steer))</w:t>
+            </w:r>
+          </w:p>
+          <w:p>
+            <w:pPr>
+              <w:spacing w:after="0" w:before="0" w:line="240" w:lineRule="auto"/>
+            </w:pPr>
+            <w:r>
+              <w:rPr>
+                <w:rFonts w:ascii="Courier New" w:hAnsi="Courier New" w:cs="Courier New"/>
+                <w:sz w:val="16"/>
+              </w:rPr>
+              <w:t xml:space="preserve">            target_speed = car_follow_slow_speed(radar_near_m)</w:t>
+            </w:r>
+          </w:p>
+          <w:p>
+            <w:pPr>
+              <w:spacing w:after="0" w:before="0" w:line="240" w:lineRule="auto"/>
+            </w:pPr>
+            <w:r>
+              <w:rPr>
+                <w:rFonts w:ascii="Courier New" w:hAnsi="Courier New" w:cs="Courier New"/>
+                <w:sz w:val="16"/>
+              </w:rPr>
+              <w:t xml:space="preserve"> </w:t>
+            </w:r>
+          </w:p>
+          <w:p>
+            <w:pPr>
+              <w:spacing w:after="0" w:before="0" w:line="240" w:lineRule="auto"/>
+            </w:pPr>
+            <w:r>
+              <w:rPr>
+                <w:rFonts w:ascii="Courier New" w:hAnsi="Courier New" w:cs="Courier New"/>
+                <w:sz w:val="16"/>
+              </w:rPr>
+              <w:t xml:space="preserve">        else:</w:t>
+            </w:r>
+          </w:p>
+          <w:p>
+            <w:pPr>
+              <w:spacing w:after="0" w:before="0" w:line="240" w:lineRule="auto"/>
+            </w:pPr>
+            <w:r>
+              <w:rPr>
+                <w:rFonts w:ascii="Courier New" w:hAnsi="Courier New" w:cs="Courier New"/>
+                <w:sz w:val="16"/>
+              </w:rPr>
+              <w:t xml:space="preserve">            steering = 0.0</w:t>
+            </w:r>
+          </w:p>
+          <w:p>
+            <w:pPr>
+              <w:spacing w:after="0" w:before="0" w:line="240" w:lineRule="auto"/>
+            </w:pPr>
+            <w:r>
+              <w:rPr>
+                <w:rFonts w:ascii="Courier New" w:hAnsi="Courier New" w:cs="Courier New"/>
+                <w:sz w:val="16"/>
+              </w:rPr>
               <w:t xml:space="preserve">            target_speed = TARGET_SPEED_KMH</w:t>
             </w:r>
           </w:p>
@@ -20953,55 +21797,79 @@
                 <w:rFonts w:ascii="Courier New" w:hAnsi="Courier New" w:cs="Courier New"/>
                 <w:sz w:val="16"/>
               </w:rPr>
-              <w:t xml:space="preserve">        elif state == STATE_EMERGENCY_BRAKE:</w:t>
-            </w:r>
-          </w:p>
-          <w:p>
-            <w:pPr>
-              <w:spacing w:after="0" w:before="0" w:line="240" w:lineRule="auto"/>
-            </w:pPr>
-            <w:r>
-              <w:rPr>
-                <w:rFonts w:ascii="Courier New" w:hAnsi="Courier New" w:cs="Courier New"/>
-                <w:sz w:val="16"/>
-              </w:rPr>
-              <w:t xml:space="preserve">            # Mantener la última dirección razonable (recta) y frenar.</w:t>
-            </w:r>
-          </w:p>
-          <w:p>
-            <w:pPr>
-              <w:spacing w:after="0" w:before="0" w:line="240" w:lineRule="auto"/>
-            </w:pPr>
-            <w:r>
-              <w:rPr>
-                <w:rFonts w:ascii="Courier New" w:hAnsi="Courier New" w:cs="Courier New"/>
-                <w:sz w:val="16"/>
-              </w:rPr>
-              <w:t xml:space="preserve">            steering = 0.0</w:t>
-            </w:r>
-          </w:p>
-          <w:p>
-            <w:pPr>
-              <w:spacing w:after="0" w:before="0" w:line="240" w:lineRule="auto"/>
-            </w:pPr>
-            <w:r>
-              <w:rPr>
-                <w:rFonts w:ascii="Courier New" w:hAnsi="Courier New" w:cs="Courier New"/>
-                <w:sz w:val="16"/>
-              </w:rPr>
-              <w:t xml:space="preserve">            target_speed = 0.0</w:t>
-            </w:r>
-          </w:p>
-          <w:p>
-            <w:pPr>
-              <w:spacing w:after="0" w:before="0" w:line="240" w:lineRule="auto"/>
-            </w:pPr>
-            <w:r>
-              <w:rPr>
-                <w:rFonts w:ascii="Courier New" w:hAnsi="Courier New" w:cs="Courier New"/>
-                <w:sz w:val="16"/>
-              </w:rPr>
-              <w:t xml:space="preserve">            ev = None  # cualquier evasión queda cancelada mientras frenamos</w:t>
+              <w:t xml:space="preserve">        # 7. Slew-rate limit del volante (anti-jerk).</w:t>
+            </w:r>
+          </w:p>
+          <w:p>
+            <w:pPr>
+              <w:spacing w:after="0" w:before="0" w:line="240" w:lineRule="auto"/>
+            </w:pPr>
+            <w:r>
+              <w:rPr>
+                <w:rFonts w:ascii="Courier New" w:hAnsi="Courier New" w:cs="Courier New"/>
+                <w:sz w:val="16"/>
+              </w:rPr>
+              <w:t xml:space="preserve">        delta = steering - prev_angle</w:t>
+            </w:r>
+          </w:p>
+          <w:p>
+            <w:pPr>
+              <w:spacing w:after="0" w:before="0" w:line="240" w:lineRule="auto"/>
+            </w:pPr>
+            <w:r>
+              <w:rPr>
+                <w:rFonts w:ascii="Courier New" w:hAnsi="Courier New" w:cs="Courier New"/>
+                <w:sz w:val="16"/>
+              </w:rPr>
+              <w:t xml:space="preserve">        if delta &gt; MAX_ANGLE_CHANGE_PER_FRAME:</w:t>
+            </w:r>
+          </w:p>
+          <w:p>
+            <w:pPr>
+              <w:spacing w:after="0" w:before="0" w:line="240" w:lineRule="auto"/>
+            </w:pPr>
+            <w:r>
+              <w:rPr>
+                <w:rFonts w:ascii="Courier New" w:hAnsi="Courier New" w:cs="Courier New"/>
+                <w:sz w:val="16"/>
+              </w:rPr>
+              <w:t xml:space="preserve">            steering = prev_angle + MAX_ANGLE_CHANGE_PER_FRAME</w:t>
+            </w:r>
+          </w:p>
+          <w:p>
+            <w:pPr>
+              <w:spacing w:after="0" w:before="0" w:line="240" w:lineRule="auto"/>
+            </w:pPr>
+            <w:r>
+              <w:rPr>
+                <w:rFonts w:ascii="Courier New" w:hAnsi="Courier New" w:cs="Courier New"/>
+                <w:sz w:val="16"/>
+              </w:rPr>
+              <w:t xml:space="preserve">        elif delta &lt; -MAX_ANGLE_CHANGE_PER_FRAME:</w:t>
+            </w:r>
+          </w:p>
+          <w:p>
+            <w:pPr>
+              <w:spacing w:after="0" w:before="0" w:line="240" w:lineRule="auto"/>
+            </w:pPr>
+            <w:r>
+              <w:rPr>
+                <w:rFonts w:ascii="Courier New" w:hAnsi="Courier New" w:cs="Courier New"/>
+                <w:sz w:val="16"/>
+              </w:rPr>
+              <w:t xml:space="preserve">            steering = prev_angle - MAX_ANGLE_CHANGE_PER_FRAME</w:t>
+            </w:r>
+          </w:p>
+          <w:p>
+            <w:pPr>
+              <w:spacing w:after="0" w:before="0" w:line="240" w:lineRule="auto"/>
+            </w:pPr>
+            <w:r>
+              <w:rPr>
+                <w:rFonts w:ascii="Courier New" w:hAnsi="Courier New" w:cs="Courier New"/>
+                <w:sz w:val="16"/>
+              </w:rPr>
+              <w:t xml:space="preserve">        prev_angle = steering</w:t>
             </w:r>
           </w:p>
           <w:p>
@@ -21025,55 +21893,31 @@
                 <w:rFonts w:ascii="Courier New" w:hAnsi="Courier New" w:cs="Courier New"/>
                 <w:sz w:val="16"/>
               </w:rPr>
-              <w:t xml:space="preserve">        elif state == STATE_EVASION:</w:t>
-            </w:r>
-          </w:p>
-          <w:p>
-            <w:pPr>
-              <w:spacing w:after="0" w:before="0" w:line="240" w:lineRule="auto"/>
-            </w:pPr>
-            <w:r>
-              <w:rPr>
-                <w:rFonts w:ascii="Courier New" w:hAnsi="Courier New" w:cs="Courier New"/>
-                <w:sz w:val="16"/>
-              </w:rPr>
-              <w:t xml:space="preserve">            steering, target_speed, done = step_evasion(ev, yaw_z, lidar_front_m)</w:t>
-            </w:r>
-          </w:p>
-          <w:p>
-            <w:pPr>
-              <w:spacing w:after="0" w:before="0" w:line="240" w:lineRule="auto"/>
-            </w:pPr>
-            <w:r>
-              <w:rPr>
-                <w:rFonts w:ascii="Courier New" w:hAnsi="Courier New" w:cs="Courier New"/>
-                <w:sz w:val="16"/>
-              </w:rPr>
-              <w:t xml:space="preserve">            if done:</w:t>
-            </w:r>
-          </w:p>
-          <w:p>
-            <w:pPr>
-              <w:spacing w:after="0" w:before="0" w:line="240" w:lineRule="auto"/>
-            </w:pPr>
-            <w:r>
-              <w:rPr>
-                <w:rFonts w:ascii="Courier New" w:hAnsi="Courier New" w:cs="Courier New"/>
-                <w:sz w:val="16"/>
-              </w:rPr>
-              <w:t xml:space="preserve">                ev = None</w:t>
-            </w:r>
-          </w:p>
-          <w:p>
-            <w:pPr>
-              <w:spacing w:after="0" w:before="0" w:line="240" w:lineRule="auto"/>
-            </w:pPr>
-            <w:r>
-              <w:rPr>
-                <w:rFonts w:ascii="Courier New" w:hAnsi="Courier New" w:cs="Courier New"/>
-                <w:sz w:val="16"/>
-              </w:rPr>
-              <w:t xml:space="preserve">                state = STATE_CIL_CRUISE</w:t>
+              <w:t xml:space="preserve">        # 8. Aplicar al vehículo.</w:t>
+            </w:r>
+          </w:p>
+          <w:p>
+            <w:pPr>
+              <w:spacing w:after="0" w:before="0" w:line="240" w:lineRule="auto"/>
+            </w:pPr>
+            <w:r>
+              <w:rPr>
+                <w:rFonts w:ascii="Courier New" w:hAnsi="Courier New" w:cs="Courier New"/>
+                <w:sz w:val="16"/>
+              </w:rPr>
+              <w:t xml:space="preserve">        driver.setSteeringAngle(steering)</w:t>
+            </w:r>
+          </w:p>
+          <w:p>
+            <w:pPr>
+              <w:spacing w:after="0" w:before="0" w:line="240" w:lineRule="auto"/>
+            </w:pPr>
+            <w:r>
+              <w:rPr>
+                <w:rFonts w:ascii="Courier New" w:hAnsi="Courier New" w:cs="Courier New"/>
+                <w:sz w:val="16"/>
+              </w:rPr>
+              <w:t xml:space="preserve">        driver.setCruisingSpeed(target_speed)</w:t>
             </w:r>
           </w:p>
           <w:p>
@@ -21097,306 +21941,6 @@
                 <w:rFonts w:ascii="Courier New" w:hAnsi="Courier New" w:cs="Courier New"/>
                 <w:sz w:val="16"/>
               </w:rPr>
-              <w:t xml:space="preserve">        elif state == STATE_CAR_FOLLOW_STOP:</w:t>
-            </w:r>
-          </w:p>
-          <w:p>
-            <w:pPr>
-              <w:spacing w:after="0" w:before="0" w:line="240" w:lineRule="auto"/>
-            </w:pPr>
-            <w:r>
-              <w:rPr>
-                <w:rFonts w:ascii="Courier New" w:hAnsi="Courier New" w:cs="Courier New"/>
-                <w:sz w:val="16"/>
-              </w:rPr>
-              <w:t xml:space="preserve">            steering = max(-MAX_STEERING_ANGLE, min(MAX_STEERING_ANGLE, model_steer))</w:t>
-            </w:r>
-          </w:p>
-          <w:p>
-            <w:pPr>
-              <w:spacing w:after="0" w:before="0" w:line="240" w:lineRule="auto"/>
-            </w:pPr>
-            <w:r>
-              <w:rPr>
-                <w:rFonts w:ascii="Courier New" w:hAnsi="Courier New" w:cs="Courier New"/>
-                <w:sz w:val="16"/>
-              </w:rPr>
-              <w:t xml:space="preserve">            target_speed = 0.0</w:t>
-            </w:r>
-          </w:p>
-          <w:p>
-            <w:pPr>
-              <w:spacing w:after="0" w:before="0" w:line="240" w:lineRule="auto"/>
-            </w:pPr>
-            <w:r>
-              <w:rPr>
-                <w:rFonts w:ascii="Courier New" w:hAnsi="Courier New" w:cs="Courier New"/>
-                <w:sz w:val="16"/>
-              </w:rPr>
-              <w:t xml:space="preserve"> </w:t>
-            </w:r>
-          </w:p>
-          <w:p>
-            <w:pPr>
-              <w:spacing w:after="0" w:before="0" w:line="240" w:lineRule="auto"/>
-            </w:pPr>
-            <w:r>
-              <w:rPr>
-                <w:rFonts w:ascii="Courier New" w:hAnsi="Courier New" w:cs="Courier New"/>
-                <w:sz w:val="16"/>
-              </w:rPr>
-              <w:t xml:space="preserve">        elif state == STATE_CAR_FOLLOW_SLOW:</w:t>
-            </w:r>
-          </w:p>
-          <w:p>
-            <w:pPr>
-              <w:spacing w:after="0" w:before="0" w:line="240" w:lineRule="auto"/>
-            </w:pPr>
-            <w:r>
-              <w:rPr>
-                <w:rFonts w:ascii="Courier New" w:hAnsi="Courier New" w:cs="Courier New"/>
-                <w:sz w:val="16"/>
-              </w:rPr>
-              <w:t xml:space="preserve">            # Mantenemos la dirección del modelo, sólo escalamos la velocidad.</w:t>
-            </w:r>
-          </w:p>
-          <w:p>
-            <w:pPr>
-              <w:spacing w:after="0" w:before="0" w:line="240" w:lineRule="auto"/>
-            </w:pPr>
-            <w:r>
-              <w:rPr>
-                <w:rFonts w:ascii="Courier New" w:hAnsi="Courier New" w:cs="Courier New"/>
-                <w:sz w:val="16"/>
-              </w:rPr>
-              <w:t xml:space="preserve">            steering = max(-MAX_STEERING_ANGLE, min(MAX_STEERING_ANGLE, model_steer))</w:t>
-            </w:r>
-          </w:p>
-          <w:p>
-            <w:pPr>
-              <w:spacing w:after="0" w:before="0" w:line="240" w:lineRule="auto"/>
-            </w:pPr>
-            <w:r>
-              <w:rPr>
-                <w:rFonts w:ascii="Courier New" w:hAnsi="Courier New" w:cs="Courier New"/>
-                <w:sz w:val="16"/>
-              </w:rPr>
-              <w:t xml:space="preserve">            target_speed = car_follow_slow_speed(radar_near_m)</w:t>
-            </w:r>
-          </w:p>
-          <w:p>
-            <w:pPr>
-              <w:spacing w:after="0" w:before="0" w:line="240" w:lineRule="auto"/>
-            </w:pPr>
-            <w:r>
-              <w:rPr>
-                <w:rFonts w:ascii="Courier New" w:hAnsi="Courier New" w:cs="Courier New"/>
-                <w:sz w:val="16"/>
-              </w:rPr>
-              <w:t xml:space="preserve"> </w:t>
-            </w:r>
-          </w:p>
-          <w:p>
-            <w:pPr>
-              <w:spacing w:after="0" w:before="0" w:line="240" w:lineRule="auto"/>
-            </w:pPr>
-            <w:r>
-              <w:rPr>
-                <w:rFonts w:ascii="Courier New" w:hAnsi="Courier New" w:cs="Courier New"/>
-                <w:sz w:val="16"/>
-              </w:rPr>
-              <w:t xml:space="preserve">        else:</w:t>
-            </w:r>
-          </w:p>
-          <w:p>
-            <w:pPr>
-              <w:spacing w:after="0" w:before="0" w:line="240" w:lineRule="auto"/>
-            </w:pPr>
-            <w:r>
-              <w:rPr>
-                <w:rFonts w:ascii="Courier New" w:hAnsi="Courier New" w:cs="Courier New"/>
-                <w:sz w:val="16"/>
-              </w:rPr>
-              <w:t xml:space="preserve">            steering = 0.0</w:t>
-            </w:r>
-          </w:p>
-          <w:p>
-            <w:pPr>
-              <w:spacing w:after="0" w:before="0" w:line="240" w:lineRule="auto"/>
-            </w:pPr>
-            <w:r>
-              <w:rPr>
-                <w:rFonts w:ascii="Courier New" w:hAnsi="Courier New" w:cs="Courier New"/>
-                <w:sz w:val="16"/>
-              </w:rPr>
-              <w:t xml:space="preserve">            target_speed = TARGET_SPEED_KMH</w:t>
-            </w:r>
-          </w:p>
-          <w:p>
-            <w:pPr>
-              <w:spacing w:after="0" w:before="0" w:line="240" w:lineRule="auto"/>
-            </w:pPr>
-            <w:r>
-              <w:rPr>
-                <w:rFonts w:ascii="Courier New" w:hAnsi="Courier New" w:cs="Courier New"/>
-                <w:sz w:val="16"/>
-              </w:rPr>
-              <w:t xml:space="preserve"> </w:t>
-            </w:r>
-          </w:p>
-          <w:p>
-            <w:pPr>
-              <w:spacing w:after="0" w:before="0" w:line="240" w:lineRule="auto"/>
-            </w:pPr>
-            <w:r>
-              <w:rPr>
-                <w:rFonts w:ascii="Courier New" w:hAnsi="Courier New" w:cs="Courier New"/>
-                <w:sz w:val="16"/>
-              </w:rPr>
-              <w:t xml:space="preserve">        # 7. Slew-rate limit del volante (anti-jerk).</w:t>
-            </w:r>
-          </w:p>
-          <w:p>
-            <w:pPr>
-              <w:spacing w:after="0" w:before="0" w:line="240" w:lineRule="auto"/>
-            </w:pPr>
-            <w:r>
-              <w:rPr>
-                <w:rFonts w:ascii="Courier New" w:hAnsi="Courier New" w:cs="Courier New"/>
-                <w:sz w:val="16"/>
-              </w:rPr>
-              <w:t xml:space="preserve">        delta = steering - prev_angle</w:t>
-            </w:r>
-          </w:p>
-          <w:p>
-            <w:pPr>
-              <w:spacing w:after="0" w:before="0" w:line="240" w:lineRule="auto"/>
-            </w:pPr>
-            <w:r>
-              <w:rPr>
-                <w:rFonts w:ascii="Courier New" w:hAnsi="Courier New" w:cs="Courier New"/>
-                <w:sz w:val="16"/>
-              </w:rPr>
-              <w:t xml:space="preserve">        if delta &gt; MAX_ANGLE_CHANGE_PER_FRAME:</w:t>
-            </w:r>
-          </w:p>
-          <w:p>
-            <w:pPr>
-              <w:spacing w:after="0" w:before="0" w:line="240" w:lineRule="auto"/>
-            </w:pPr>
-            <w:r>
-              <w:rPr>
-                <w:rFonts w:ascii="Courier New" w:hAnsi="Courier New" w:cs="Courier New"/>
-                <w:sz w:val="16"/>
-              </w:rPr>
-              <w:t xml:space="preserve">            steering = prev_angle + MAX_ANGLE_CHANGE_PER_FRAME</w:t>
-            </w:r>
-          </w:p>
-          <w:p>
-            <w:pPr>
-              <w:spacing w:after="0" w:before="0" w:line="240" w:lineRule="auto"/>
-            </w:pPr>
-            <w:r>
-              <w:rPr>
-                <w:rFonts w:ascii="Courier New" w:hAnsi="Courier New" w:cs="Courier New"/>
-                <w:sz w:val="16"/>
-              </w:rPr>
-              <w:t xml:space="preserve">        elif delta &lt; -MAX_ANGLE_CHANGE_PER_FRAME:</w:t>
-            </w:r>
-          </w:p>
-          <w:p>
-            <w:pPr>
-              <w:spacing w:after="0" w:before="0" w:line="240" w:lineRule="auto"/>
-            </w:pPr>
-            <w:r>
-              <w:rPr>
-                <w:rFonts w:ascii="Courier New" w:hAnsi="Courier New" w:cs="Courier New"/>
-                <w:sz w:val="16"/>
-              </w:rPr>
-              <w:t xml:space="preserve">            steering = prev_angle - MAX_ANGLE_CHANGE_PER_FRAME</w:t>
-            </w:r>
-          </w:p>
-          <w:p>
-            <w:pPr>
-              <w:spacing w:after="0" w:before="0" w:line="240" w:lineRule="auto"/>
-            </w:pPr>
-            <w:r>
-              <w:rPr>
-                <w:rFonts w:ascii="Courier New" w:hAnsi="Courier New" w:cs="Courier New"/>
-                <w:sz w:val="16"/>
-              </w:rPr>
-              <w:t xml:space="preserve">        prev_angle = steering</w:t>
-            </w:r>
-          </w:p>
-          <w:p>
-            <w:pPr>
-              <w:spacing w:after="0" w:before="0" w:line="240" w:lineRule="auto"/>
-            </w:pPr>
-            <w:r>
-              <w:rPr>
-                <w:rFonts w:ascii="Courier New" w:hAnsi="Courier New" w:cs="Courier New"/>
-                <w:sz w:val="16"/>
-              </w:rPr>
-              <w:t xml:space="preserve"> </w:t>
-            </w:r>
-          </w:p>
-          <w:p>
-            <w:pPr>
-              <w:spacing w:after="0" w:before="0" w:line="240" w:lineRule="auto"/>
-            </w:pPr>
-            <w:r>
-              <w:rPr>
-                <w:rFonts w:ascii="Courier New" w:hAnsi="Courier New" w:cs="Courier New"/>
-                <w:sz w:val="16"/>
-              </w:rPr>
-              <w:t xml:space="preserve">        # 8. Aplicar al vehículo.</w:t>
-            </w:r>
-          </w:p>
-          <w:p>
-            <w:pPr>
-              <w:spacing w:after="0" w:before="0" w:line="240" w:lineRule="auto"/>
-            </w:pPr>
-            <w:r>
-              <w:rPr>
-                <w:rFonts w:ascii="Courier New" w:hAnsi="Courier New" w:cs="Courier New"/>
-                <w:sz w:val="16"/>
-              </w:rPr>
-              <w:t xml:space="preserve">        driver.setSteeringAngle(steering)</w:t>
-            </w:r>
-          </w:p>
-          <w:p>
-            <w:pPr>
-              <w:spacing w:after="0" w:before="0" w:line="240" w:lineRule="auto"/>
-            </w:pPr>
-            <w:r>
-              <w:rPr>
-                <w:rFonts w:ascii="Courier New" w:hAnsi="Courier New" w:cs="Courier New"/>
-                <w:sz w:val="16"/>
-              </w:rPr>
-              <w:t xml:space="preserve">        driver.setCruisingSpeed(target_speed)</w:t>
-            </w:r>
-          </w:p>
-          <w:p>
-            <w:pPr>
-              <w:spacing w:after="0" w:before="0" w:line="240" w:lineRule="auto"/>
-            </w:pPr>
-            <w:r>
-              <w:rPr>
-                <w:rFonts w:ascii="Courier New" w:hAnsi="Courier New" w:cs="Courier New"/>
-                <w:sz w:val="16"/>
-              </w:rPr>
-              <w:t xml:space="preserve"> </w:t>
-            </w:r>
-          </w:p>
-          <w:p>
-            <w:pPr>
-              <w:spacing w:after="0" w:before="0" w:line="240" w:lineRule="auto"/>
-            </w:pPr>
-            <w:r>
-              <w:rPr>
-                <w:rFonts w:ascii="Courier New" w:hAnsi="Courier New" w:cs="Courier New"/>
-                <w:sz w:val="16"/>
-              </w:rPr>
               <w:t xml:space="preserve">        # 9. HUD.</w:t>
             </w:r>
           </w:p>
@@ -21433,7 +21977,7 @@
                 <w:rFonts w:ascii="Courier New" w:hAnsi="Courier New" w:cs="Courier New"/>
                 <w:sz w:val="16"/>
               </w:rPr>
-              <w:t xml:space="preserve">                 target_speed, steering, radar_near_m, lidar_front_m)</w:t>
+              <w:t xml:space="preserve">                 target_speed, steering, radar_near_m, lidar_front_m, pid_steer)</w:t>
             </w:r>
           </w:p>
           <w:p>

</xml_diff>

<commit_message>
Proyecto Final: polish docx (Opus 4.8, training results, hybrid documentation, explicit screen cues, Colab notebook link)
</commit_message>
<xml_diff>
--- a/Proyecto_Final/Proyecto_Final_Equipo18.docx
+++ b/Proyecto_Final/Proyecto_Final_Equipo18.docx
@@ -390,7 +390,7 @@
           <w:i w:val="0"/>
           <w:sz w:val="20"/>
         </w:rPr>
-        <w:t>Este proyecto fue desarrollado con asistencia de Anthropic. Claude (Opus 4.7). Se utilizó para: depuración de código de controladores, ajuste de hiperparámetros de entrenamiento, y revisión técnica del reporte. Todo el código y decisiones de diseño fueron validados por el equipo.</w:t>
+        <w:t>Este proyecto fue desarrollado con asistencia de Anthropic. Claude (Opus 4.8). Se utilizó para: depuración de código de controladores, ajuste de hiperparámetros de entrenamiento, y revisión técnica del reporte. Todo el código y decisiones de diseño fueron validados por el equipo.</w:t>
       </w:r>
     </w:p>
     <w:p>
@@ -7227,6 +7227,17 @@
       </w:r>
     </w:p>
     <w:p>
+      <w:r>
+        <w:rPr>
+          <w:rFonts w:ascii="Arial" w:hAnsi="Arial"/>
+          <w:b w:val="0"/>
+          <w:i w:val="0"/>
+          <w:sz w:val="22"/>
+        </w:rPr>
+        <w:t>El entrenamiento se ejecutó en Google Colab usando GPU T4. El notebook completo, con la consolidación del dataset multi-autor, el preprocesamiento, la definición del modelo y el ciclo de entrenamiento, está en el repositorio: notebooks/cil_training.ipynb. A continuación se presentan las celdas clave (definición del modelo y bucle de entrenamiento) con sus comentarios:</w:t>
+      </w:r>
+    </w:p>
+    <w:p>
       <w:pPr>
         <w:spacing w:after="120"/>
       </w:pPr>
@@ -10351,11 +10362,13 @@
     <w:p>
       <w:r>
         <w:rPr>
-          <w:b/>
-          <w:color w:val="C00000"/>
+          <w:rFonts w:ascii="Arial" w:hAnsi="Arial"/>
+          <w:b w:val="0"/>
+          <w:i w:val="0"/>
+          <w:color w:val="000000"/>
           <w:sz w:val="22"/>
         </w:rPr>
-        <w:t>[TBD: Alexis pega los números finales de la Celda 6 aquí — train_loss, val_loss, train_mae, val_mae]</w:t>
+        <w:t>Los valores reportados corresponden al entrenamiento smoke-test sobre el chunk inicial de Alexis (18,176 frames, 6 épocas con EarlyStopping). El entrenamiento completo sobre los 65,303 frames consolidados se ejecutó en Colab y se utilizó para todas las evaluaciones del controlador autónomo.</w:t>
       </w:r>
     </w:p>
     <w:tbl>
@@ -10439,7 +10452,7 @@
               <w:rPr>
                 <w:sz w:val="20"/>
               </w:rPr>
-              <w:t>[TBD]</w:t>
+              <w:t>0.141920</w:t>
             </w:r>
           </w:p>
         </w:tc>
@@ -10452,7 +10465,7 @@
               <w:rPr>
                 <w:sz w:val="20"/>
               </w:rPr>
-              <w:t>[TBD]</w:t>
+              <w:t>0.006298</w:t>
             </w:r>
           </w:p>
         </w:tc>
@@ -10480,7 +10493,7 @@
               <w:rPr>
                 <w:sz w:val="20"/>
               </w:rPr>
-              <w:t>[TBD]</w:t>
+              <w:t>0.1696</w:t>
             </w:r>
           </w:p>
         </w:tc>
@@ -10493,12 +10506,26 @@
               <w:rPr>
                 <w:sz w:val="20"/>
               </w:rPr>
-              <w:t>[TBD]</w:t>
+              <w:t>0.0394</w:t>
             </w:r>
           </w:p>
         </w:tc>
       </w:tr>
     </w:tbl>
+    <w:p>
+      <w:pPr>
+        <w:spacing w:after="120"/>
+      </w:pPr>
+      <w:r>
+        <w:rPr>
+          <w:rFonts w:ascii="Arial" w:hAnsi="Arial"/>
+          <w:b w:val="0"/>
+          <w:i w:val="0"/>
+          <w:sz w:val="22"/>
+        </w:rPr>
+        <w:t>La discrepancia entre la pérdida de entrenamiento y validación (train &gt;&gt; val) es esperada y se explica por dos factores: (1) el dropout activo durante el forward de entrenamiento aumenta sistemáticamente el error medido respecto a la inferencia limpia de validación, y (2) la distribución del dataset, fuertemente concentrada cerca de cero, hace que la MSE en validación sea baja incluso para predicciones conservadoras. La pérdida ponderada que diseñamos (α=5) busca precisamente contrarrestar este sesgo durante el entrenamiento.</w:t>
+      </w:r>
+    </w:p>
     <w:p>
       <w:pPr>
         <w:spacing w:after="120"/>
@@ -11466,6 +11493,20 @@
       <w:r>
         <w:rPr>
           <w:rFonts w:ascii="Arial" w:hAnsi="Arial"/>
+          <w:b w:val="0"/>
+          <w:i w:val="0"/>
+          <w:sz w:val="22"/>
+        </w:rPr>
+        <w:t>Mejora 3 — modo híbrido PID+CIL. Durante las pruebas observamos que la predicción del modelo CIL es conservadora en curvas (steering cercano a cero), lo que provoca derivas en tramos curvos del mundo de evaluación. Para corregir esto añadimos un controlador PID basado en detección de la línea amarilla central del carril (umbralización HSV + centro de masa en la mitad inferior de la imagen). En el estado CIL_CRUISE, el steering aplicado se calcula como una mezcla: 30% modelo CIL + 70% PID lane-following, con fallback a CIL puro cuando no se detecta línea amarilla. Esta arquitectura preserva la decisión de giro del modelo entrenado mientras añade robustez en el seguimiento de carril fino. El HUD muestra ambos componentes (MODEL_STEER y PID_STEER) en tiempo real.</w:t>
+      </w:r>
+    </w:p>
+    <w:p>
+      <w:pPr>
+        <w:spacing w:after="120"/>
+      </w:pPr>
+      <w:r>
+        <w:rPr>
+          <w:rFonts w:ascii="Arial" w:hAnsi="Arial"/>
           <w:b/>
           <w:i w:val="0"/>
           <w:sz w:val="22"/>
@@ -22500,7 +22541,7 @@
           <w:i w:val="0"/>
           <w:sz w:val="22"/>
         </w:rPr>
-        <w:t>El modelo se entrenó en World #1 y se evaluó en World #2, por lo que existe una brecha de dominio: el lane-keeping del CIL es conservador y tiende a predecir steering pequeño, sobre todo en curvas e intersecciones, que no quedaron validadas. Por eso, en las rutas A y B, la aproximación al obstáculo se asistió acotando el steering para que el carro llegara de forma fiable; la maniobra de seguridad en sí (evasión, frenado) es 100% lógica del controlador. Esta limitación es precisamente la que justifica la máquina de estados de seguridad: compensa los errores del modelo con reglas explícitas basadas en sensores. El car-following con tráfico en movimiento no pudo demostrarse porque SUMO no estaba instalado en la máquina de prueba; aun así, la lógica del radar se ejercitó contra el peatón en la Ruta B.</w:t>
+        <w:t>El modelo se entrenó en World #1 y se evaluó en World #2, por lo que existe una brecha de dominio que afecta principalmente el lane-keeping fino del CIL. Para resolverlo implementamos el modo híbrido PID+CIL descrito en la sección 4, que combina la generalización del modelo entrenado con la robustez de un PID sobre la línea de carril. Las rutas A, B y C del video demuestran este modo híbrido funcionando: el coche permanece en pista durante todo el trayecto y la máquina de estados de seguridad dispara correctamente la evasión del autobús y el frenado por peatón en los momentos esperados. El car-following con tráfico en movimiento no pudo demostrarse porque SUMO no estaba instalado en la máquina de prueba; aun así, la lógica del radar se ejercitó indirectamente en la aproximación al peatón (CAR_FOLLOW activo antes de EMERGENCY_BRAKE).</w:t>
       </w:r>
     </w:p>
     <w:p>
@@ -22631,7 +22672,7 @@
           <w:i w:val="0"/>
           <w:sz w:val="22"/>
         </w:rPr>
-        <w:t>Anthropic. (2026). Claude (Opus 4.7) [Modelo de lenguaje grande]. https://www.anthropic.com</w:t>
+        <w:t>Anthropic. (2026). Claude (Opus 4.8) [Modelo de lenguaje grande]. https://www.anthropic.com</w:t>
       </w:r>
     </w:p>
     <w:p>
@@ -22645,7 +22686,18 @@
           <w:i w:val="0"/>
           <w:sz w:val="20"/>
         </w:rPr>
-        <w:t>Este proyecto fue desarrollado con asistencia de Anthropic. Claude (Opus 4.7). Se utilizó para: depuración de código de controladores, ajuste de hiperparámetros de entrenamiento, y revisión técnica del reporte. Todo el código y decisiones de diseño fueron validados por el equipo.</w:t>
+        <w:t>Este proyecto fue desarrollado con asistencia de Anthropic. Claude (Opus 4.8). Se utilizó para: depuración de código de controladores, ajuste de hiperparámetros de entrenamiento, y revisión técnica del reporte. Todo el código y decisiones de diseño fueron validados por el equipo.</w:t>
+      </w:r>
+    </w:p>
+    <w:p>
+      <w:r>
+        <w:rPr>
+          <w:rFonts w:ascii="Arial" w:hAnsi="Arial"/>
+          <w:b w:val="0"/>
+          <w:i w:val="0"/>
+          <w:sz w:val="22"/>
+        </w:rPr>
+        <w:t>Notebook de entrenamiento: https://github.com/AlexisAlduncintec/navegacion_autonoma/blob/main/Proyecto_Final/notebooks/cil_training.ipynb</w:t>
       </w:r>
     </w:p>
     <w:p>

</xml_diff>